<commit_message>
test: tested kubernetes for psp - all functionalities work
</commit_message>
<xml_diff>
--- a/minikube-and-kubernetes.docx
+++ b/minikube-and-kubernetes.docx
@@ -2,6 +2,52 @@
 <file path=word/document.xml><?xml version="1.0" encoding="utf-8"?>
 <w:document xmlns:wpc="http://schemas.microsoft.com/office/word/2010/wordprocessingCanvas" xmlns:cx="http://schemas.microsoft.com/office/drawing/2014/chartex" xmlns:cx1="http://schemas.microsoft.com/office/drawing/2015/9/8/chartex" xmlns:mc="http://schemas.openxmlformats.org/markup-compatibility/2006" xmlns:o="urn:schemas-microsoft-com:office:office" xmlns:r="http://schemas.openxmlformats.org/officeDocument/2006/relationships" xmlns:m="http://schemas.openxmlformats.org/officeDocument/2006/math" xmlns:v="urn:schemas-microsoft-com:vml" xmlns:wp14="http://schemas.microsoft.com/office/word/2010/wordprocessingDrawing" xmlns:wp="http://schemas.openxmlformats.org/drawingml/2006/wordprocessingDrawing" xmlns:w10="urn:schemas-microsoft-com:office:word" xmlns:w="http://schemas.openxmlformats.org/wordprocessingml/2006/main" xmlns:w14="http://schemas.microsoft.com/office/word/2010/wordml" xmlns:w15="http://schemas.microsoft.com/office/word/2012/wordml" xmlns:w16se="http://schemas.microsoft.com/office/word/2015/wordml/symex" xmlns:wpg="http://schemas.microsoft.com/office/word/2010/wordprocessingGroup" xmlns:wpi="http://schemas.microsoft.com/office/word/2010/wordprocessingInk" xmlns:wne="http://schemas.microsoft.com/office/word/2006/wordml" xmlns:wps="http://schemas.microsoft.com/office/word/2010/wordprocessingShape" mc:Ignorable="w14 w15 w16se wp14">
   <w:body>
+    <w:p>
+      <w:r>
+        <w:t xml:space="preserve">Da bi </w:t>
+      </w:r>
+      <w:proofErr w:type="spellStart"/>
+      <w:r>
+        <w:t>pokrenuli</w:t>
+      </w:r>
+      <w:proofErr w:type="spellEnd"/>
+      <w:r>
+        <w:t xml:space="preserve"> </w:t>
+      </w:r>
+      <w:proofErr w:type="spellStart"/>
+      <w:r>
+        <w:t>minikube</w:t>
+      </w:r>
+      <w:proofErr w:type="spellEnd"/>
+      <w:r>
+        <w:t xml:space="preserve"> </w:t>
+      </w:r>
+      <w:proofErr w:type="spellStart"/>
+      <w:r>
+        <w:t>na</w:t>
+      </w:r>
+      <w:proofErr w:type="spellEnd"/>
+      <w:r>
+        <w:t xml:space="preserve"> </w:t>
+      </w:r>
+      <w:proofErr w:type="spellStart"/>
+      <w:r>
+        <w:t>pocetku</w:t>
+      </w:r>
+      <w:proofErr w:type="spellEnd"/>
+    </w:p>
+    <w:p>
+      <w:proofErr w:type="spellStart"/>
+      <w:r>
+        <w:t>minikube</w:t>
+      </w:r>
+      <w:proofErr w:type="spellEnd"/>
+      <w:r>
+        <w:t xml:space="preserve"> start</w:t>
+      </w:r>
+    </w:p>
+    <w:p/>
+    <w:p/>
     <w:p>
       <w:r>
         <w:t>*</w:t>
@@ -157,7 +203,7 @@
           <w:sz w:val="20"/>
           <w:szCs w:val="20"/>
         </w:rPr>
-        <w:t xml:space="preserve"> build -t moj-</w:t>
+        <w:t xml:space="preserve"> build -t psp-backend:6.</w:t>
       </w:r>
       <w:proofErr w:type="gramStart"/>
       <w:r>
@@ -166,102 +212,19 @@
           <w:sz w:val="20"/>
           <w:szCs w:val="20"/>
         </w:rPr>
-        <w:t>backend:v</w:t>
+        <w:t>0</w:t>
+      </w:r>
+      <w:r>
+        <w:rPr>
+          <w:rFonts w:ascii="Courier New" w:eastAsia="Times New Roman" w:hAnsi="Courier New" w:cs="Courier New"/>
+          <w:sz w:val="20"/>
+          <w:szCs w:val="20"/>
+        </w:rPr>
+        <w:t xml:space="preserve"> .</w:t>
       </w:r>
       <w:proofErr w:type="gramEnd"/>
-      <w:r>
-        <w:rPr>
-          <w:rFonts w:ascii="Courier New" w:eastAsia="Times New Roman" w:hAnsi="Courier New" w:cs="Courier New"/>
-          <w:sz w:val="20"/>
-          <w:szCs w:val="20"/>
-        </w:rPr>
-        <w:t>4</w:t>
-      </w:r>
-      <w:r>
-        <w:rPr>
-          <w:rFonts w:ascii="Courier New" w:eastAsia="Times New Roman" w:hAnsi="Courier New" w:cs="Courier New"/>
-          <w:sz w:val="20"/>
-          <w:szCs w:val="20"/>
-        </w:rPr>
-        <w:t xml:space="preserve"> .</w:t>
-      </w:r>
     </w:p>
     <w:p/>
-    <w:p>
-      <w:r>
-        <w:t>*</w:t>
-      </w:r>
-      <w:proofErr w:type="spellStart"/>
-      <w:r>
-        <w:t>Ako</w:t>
-      </w:r>
-      <w:proofErr w:type="spellEnd"/>
-      <w:r>
-        <w:t xml:space="preserve"> </w:t>
-      </w:r>
-      <w:proofErr w:type="spellStart"/>
-      <w:r>
-        <w:t>sam</w:t>
-      </w:r>
-      <w:proofErr w:type="spellEnd"/>
-      <w:r>
-        <w:t xml:space="preserve"> </w:t>
-      </w:r>
-      <w:proofErr w:type="spellStart"/>
-      <w:r>
-        <w:t>menjao</w:t>
-      </w:r>
-      <w:proofErr w:type="spellEnd"/>
-      <w:r>
-        <w:t xml:space="preserve"> </w:t>
-      </w:r>
-      <w:proofErr w:type="spellStart"/>
-      <w:r>
-        <w:t>yaml</w:t>
-      </w:r>
-      <w:proofErr w:type="spellEnd"/>
-      <w:r>
-        <w:t xml:space="preserve"> </w:t>
-      </w:r>
-      <w:proofErr w:type="spellStart"/>
-      <w:r>
-        <w:t>fajl</w:t>
-      </w:r>
-      <w:proofErr w:type="spellEnd"/>
-      <w:r>
-        <w:t xml:space="preserve"> </w:t>
-      </w:r>
-      <w:proofErr w:type="spellStart"/>
-      <w:r>
-        <w:t>za</w:t>
-      </w:r>
-      <w:proofErr w:type="spellEnd"/>
-      <w:r>
-        <w:t xml:space="preserve"> </w:t>
-      </w:r>
-      <w:proofErr w:type="spellStart"/>
-      <w:r>
-        <w:t>kubernetes</w:t>
-      </w:r>
-      <w:proofErr w:type="spellEnd"/>
-    </w:p>
-    <w:p>
-      <w:proofErr w:type="spellStart"/>
-      <w:r>
-        <w:t>kubectl</w:t>
-      </w:r>
-      <w:proofErr w:type="spellEnd"/>
-      <w:r>
-        <w:t xml:space="preserve"> apply -f </w:t>
-      </w:r>
-      <w:proofErr w:type="spellStart"/>
-      <w:proofErr w:type="gramStart"/>
-      <w:r>
-        <w:t>deployment.yaml</w:t>
-      </w:r>
-      <w:proofErr w:type="spellEnd"/>
-      <w:proofErr w:type="gramEnd"/>
-    </w:p>
     <w:p/>
     <w:p>
       <w:r>
@@ -334,7 +297,6 @@
           <w:tab w:val="left" w:pos="14656"/>
         </w:tabs>
         <w:spacing w:after="0" w:line="240" w:lineRule="auto"/>
-        <w:ind w:firstLine="720"/>
         <w:rPr>
           <w:rFonts w:ascii="Courier New" w:eastAsia="Times New Roman" w:hAnsi="Courier New" w:cs="Courier New"/>
           <w:sz w:val="20"/>
@@ -365,26 +327,109 @@
           <w:sz w:val="20"/>
           <w:szCs w:val="20"/>
         </w:rPr>
-        <w:t xml:space="preserve"> image load moj-</w:t>
-      </w:r>
+        <w:t xml:space="preserve"> image load psp</w:t>
+      </w:r>
+      <w:r>
+        <w:rPr>
+          <w:rFonts w:ascii="Courier New" w:eastAsia="Times New Roman" w:hAnsi="Courier New" w:cs="Courier New"/>
+          <w:sz w:val="20"/>
+          <w:szCs w:val="20"/>
+        </w:rPr>
+        <w:t>-backend:6.0</w:t>
+      </w:r>
+    </w:p>
+    <w:p/>
+    <w:p>
+      <w:r>
+        <w:t>*</w:t>
+      </w:r>
+      <w:proofErr w:type="spellStart"/>
+      <w:r>
+        <w:t>Ako</w:t>
+      </w:r>
+      <w:proofErr w:type="spellEnd"/>
+      <w:r>
+        <w:t xml:space="preserve"> </w:t>
+      </w:r>
+      <w:proofErr w:type="spellStart"/>
+      <w:r>
+        <w:t>sam</w:t>
+      </w:r>
+      <w:proofErr w:type="spellEnd"/>
+      <w:r>
+        <w:t xml:space="preserve"> </w:t>
+      </w:r>
+      <w:proofErr w:type="spellStart"/>
+      <w:r>
+        <w:t>menjao</w:t>
+      </w:r>
+      <w:proofErr w:type="spellEnd"/>
+      <w:r>
+        <w:t xml:space="preserve"> </w:t>
+      </w:r>
+      <w:proofErr w:type="spellStart"/>
+      <w:r>
+        <w:t>yaml</w:t>
+      </w:r>
+      <w:proofErr w:type="spellEnd"/>
+      <w:r>
+        <w:t xml:space="preserve"> </w:t>
+      </w:r>
+      <w:proofErr w:type="spellStart"/>
+      <w:r>
+        <w:t>fajl</w:t>
+      </w:r>
+      <w:proofErr w:type="spellEnd"/>
+      <w:r>
+        <w:t xml:space="preserve"> </w:t>
+      </w:r>
+      <w:proofErr w:type="spellStart"/>
+      <w:r>
+        <w:t>za</w:t>
+      </w:r>
+      <w:proofErr w:type="spellEnd"/>
+      <w:r>
+        <w:t xml:space="preserve"> </w:t>
+      </w:r>
+      <w:proofErr w:type="spellStart"/>
+      <w:r>
+        <w:t>kubernetes</w:t>
+      </w:r>
+      <w:proofErr w:type="spellEnd"/>
+    </w:p>
+    <w:p>
+      <w:proofErr w:type="spellStart"/>
+      <w:r>
+        <w:t>kubectl</w:t>
+      </w:r>
+      <w:proofErr w:type="spellEnd"/>
+      <w:r>
+        <w:t xml:space="preserve"> apply -f </w:t>
+      </w:r>
+      <w:proofErr w:type="spellStart"/>
       <w:proofErr w:type="gramStart"/>
       <w:r>
-        <w:rPr>
-          <w:rFonts w:ascii="Courier New" w:eastAsia="Times New Roman" w:hAnsi="Courier New" w:cs="Courier New"/>
-          <w:sz w:val="20"/>
-          <w:szCs w:val="20"/>
-        </w:rPr>
-        <w:t>backend:v</w:t>
-      </w:r>
+        <w:t>deployment.yaml</w:t>
+      </w:r>
+      <w:proofErr w:type="spellEnd"/>
       <w:proofErr w:type="gramEnd"/>
-      <w:r>
-        <w:rPr>
-          <w:rFonts w:ascii="Courier New" w:eastAsia="Times New Roman" w:hAnsi="Courier New" w:cs="Courier New"/>
-          <w:sz w:val="20"/>
-          <w:szCs w:val="20"/>
-        </w:rPr>
-        <w:t>4</w:t>
-      </w:r>
+    </w:p>
+    <w:p>
+      <w:proofErr w:type="spellStart"/>
+      <w:r>
+        <w:t>kubectl</w:t>
+      </w:r>
+      <w:proofErr w:type="spellEnd"/>
+      <w:r>
+        <w:t xml:space="preserve"> apply –f </w:t>
+      </w:r>
+      <w:proofErr w:type="spellStart"/>
+      <w:proofErr w:type="gramStart"/>
+      <w:r>
+        <w:t>service.yaml</w:t>
+      </w:r>
+      <w:proofErr w:type="spellEnd"/>
+      <w:proofErr w:type="gramEnd"/>
     </w:p>
     <w:p>
       <w:pPr>
@@ -678,8 +723,6 @@
         </w:rPr>
         <w:t>podove</w:t>
       </w:r>
-      <w:bookmarkStart w:id="0" w:name="_GoBack"/>
-      <w:bookmarkEnd w:id="0"/>
       <w:proofErr w:type="spellEnd"/>
     </w:p>
     <w:p>
@@ -1092,8 +1135,8 @@
       <w:pPr>
         <w:pStyle w:val="NormalWeb"/>
         <w:rPr>
-          <w:rFonts w:ascii="Courier New" w:hAnsi="Courier New" w:cs="Courier New"/>
-          <w:szCs w:val="20"/>
+          <w:rFonts w:ascii="Noto Sans" w:hAnsi="Noto Sans" w:cs="Noto Sans"/>
+          <w:sz w:val="20"/>
         </w:rPr>
       </w:pPr>
       <w:proofErr w:type="spellStart"/>
@@ -1345,6 +1388,108 @@
         </w:rPr>
         <w:t xml:space="preserve"> tunnel</w:t>
       </w:r>
+      <w:r>
+        <w:rPr>
+          <w:rFonts w:ascii="Courier New" w:hAnsi="Courier New" w:cs="Courier New"/>
+          <w:sz w:val="20"/>
+          <w:szCs w:val="20"/>
+        </w:rPr>
+        <w:br/>
+      </w:r>
+      <w:proofErr w:type="spellStart"/>
+      <w:r>
+        <w:rPr>
+          <w:rFonts w:ascii="Noto Sans" w:hAnsi="Noto Sans" w:cs="Noto Sans"/>
+          <w:sz w:val="20"/>
+        </w:rPr>
+        <w:t>kubectl</w:t>
+      </w:r>
+      <w:proofErr w:type="spellEnd"/>
+      <w:r>
+        <w:rPr>
+          <w:rFonts w:ascii="Noto Sans" w:hAnsi="Noto Sans" w:cs="Noto Sans"/>
+          <w:sz w:val="20"/>
+        </w:rPr>
+        <w:t xml:space="preserve"> port-forward svc/</w:t>
+      </w:r>
+      <w:proofErr w:type="spellStart"/>
+      <w:r>
+        <w:rPr>
+          <w:rFonts w:ascii="Noto Sans" w:hAnsi="Noto Sans" w:cs="Noto Sans"/>
+          <w:sz w:val="20"/>
+        </w:rPr>
+        <w:t>psp</w:t>
+      </w:r>
+      <w:proofErr w:type="spellEnd"/>
+      <w:r>
+        <w:rPr>
+          <w:rFonts w:ascii="Noto Sans" w:hAnsi="Noto Sans" w:cs="Noto Sans"/>
+          <w:sz w:val="20"/>
+        </w:rPr>
+        <w:t>-backend-service 8445:8445</w:t>
+      </w:r>
+    </w:p>
+    <w:p>
+      <w:pPr>
+        <w:pStyle w:val="NormalWeb"/>
+        <w:rPr>
+          <w:rFonts w:ascii="Noto Sans" w:hAnsi="Noto Sans" w:cs="Noto Sans"/>
+          <w:sz w:val="20"/>
+        </w:rPr>
+      </w:pPr>
+    </w:p>
+    <w:p>
+      <w:pPr>
+        <w:pStyle w:val="NormalWeb"/>
+        <w:rPr>
+          <w:rFonts w:ascii="Courier New" w:hAnsi="Courier New" w:cs="Courier New"/>
+          <w:sz w:val="20"/>
+          <w:szCs w:val="20"/>
+        </w:rPr>
+      </w:pPr>
+      <w:proofErr w:type="spellStart"/>
+      <w:r>
+        <w:rPr>
+          <w:rFonts w:ascii="Noto Sans" w:hAnsi="Noto Sans" w:cs="Noto Sans"/>
+          <w:sz w:val="20"/>
+        </w:rPr>
+        <w:t>Brisanje</w:t>
+      </w:r>
+      <w:proofErr w:type="spellEnd"/>
+      <w:r>
+        <w:rPr>
+          <w:rFonts w:ascii="Noto Sans" w:hAnsi="Noto Sans" w:cs="Noto Sans"/>
+          <w:sz w:val="20"/>
+        </w:rPr>
+        <w:t xml:space="preserve"> deployment-a </w:t>
+      </w:r>
+      <w:r>
+        <w:rPr>
+          <w:rFonts w:ascii="Noto Sans" w:hAnsi="Noto Sans" w:cs="Noto Sans"/>
+          <w:sz w:val="20"/>
+        </w:rPr>
+        <w:br/>
+      </w:r>
+      <w:proofErr w:type="spellStart"/>
+      <w:r>
+        <w:rPr>
+          <w:rFonts w:ascii="Courier New" w:hAnsi="Courier New" w:cs="Courier New"/>
+          <w:sz w:val="20"/>
+          <w:szCs w:val="20"/>
+        </w:rPr>
+        <w:t>kubectl</w:t>
+      </w:r>
+      <w:proofErr w:type="spellEnd"/>
+      <w:r>
+        <w:rPr>
+          <w:rFonts w:ascii="Courier New" w:hAnsi="Courier New" w:cs="Courier New"/>
+          <w:sz w:val="20"/>
+          <w:szCs w:val="20"/>
+        </w:rPr>
+        <w:t xml:space="preserve"> delete deployment moj-backend-deployment</w:t>
+      </w:r>
+      <w:bookmarkStart w:id="0" w:name="_GoBack"/>
+      <w:bookmarkEnd w:id="0"/>
     </w:p>
     <w:p>
       <w:pPr>
@@ -1360,7 +1505,6 @@
         <w:rPr>
           <w:noProof/>
         </w:rPr>
-        <w:lastRenderedPageBreak/>
         <w:drawing>
           <wp:inline distT="0" distB="0" distL="0" distR="0" wp14:anchorId="24A6037E" wp14:editId="615573A7">
             <wp:extent cx="5943600" cy="3343275"/>

</xml_diff>

<commit_message>
feat: implement MFA - verification code
</commit_message>
<xml_diff>
--- a/minikube-and-kubernetes.docx
+++ b/minikube-and-kubernetes.docx
@@ -212,7 +212,7 @@
           <w:sz w:val="20"/>
           <w:szCs w:val="20"/>
         </w:rPr>
-        <w:t>0</w:t>
+        <w:t>1</w:t>
       </w:r>
       <w:r>
         <w:rPr>
@@ -303,6 +303,7 @@
           <w:szCs w:val="20"/>
         </w:rPr>
       </w:pPr>
+      <w:bookmarkStart w:id="0" w:name="_GoBack"/>
       <w:proofErr w:type="spellStart"/>
       <w:r>
         <w:rPr>
@@ -335,9 +336,10 @@
           <w:sz w:val="20"/>
           <w:szCs w:val="20"/>
         </w:rPr>
-        <w:t>-backend:6.0</w:t>
-      </w:r>
-    </w:p>
+        <w:t>-backend:6.1</w:t>
+      </w:r>
+    </w:p>
+    <w:bookmarkEnd w:id="0"/>
     <w:p/>
     <w:p>
       <w:r>
@@ -427,6 +429,18 @@
       <w:proofErr w:type="gramStart"/>
       <w:r>
         <w:t>service.yaml</w:t>
+      </w:r>
+      <w:proofErr w:type="spellEnd"/>
+      <w:proofErr w:type="gramEnd"/>
+    </w:p>
+    <w:p>
+      <w:r>
+        <w:t xml:space="preserve">kubectl apply –f </w:t>
+      </w:r>
+      <w:proofErr w:type="spellStart"/>
+      <w:proofErr w:type="gramStart"/>
+      <w:r>
+        <w:t>redis.yaml</w:t>
       </w:r>
       <w:proofErr w:type="spellEnd"/>
       <w:proofErr w:type="gramEnd"/>
@@ -1377,6 +1391,7 @@
           <w:sz w:val="20"/>
           <w:szCs w:val="20"/>
         </w:rPr>
+        <w:lastRenderedPageBreak/>
         <w:t>minikube</w:t>
       </w:r>
       <w:proofErr w:type="spellEnd"/>
@@ -1488,8 +1503,6 @@
         </w:rPr>
         <w:t xml:space="preserve"> delete deployment moj-backend-deployment</w:t>
       </w:r>
-      <w:bookmarkStart w:id="0" w:name="_GoBack"/>
-      <w:bookmarkEnd w:id="0"/>
     </w:p>
     <w:p>
       <w:pPr>

</xml_diff>